<commit_message>
Add Chapter 3 Java exercises
</commit_message>
<xml_diff>
--- a/ASCII Vs UNICODE.docx
+++ b/ASCII Vs UNICODE.docx
@@ -29,21 +29,7 @@
         <w:rPr>
           <w:lang w:val="en-NG"/>
         </w:rPr>
-        <w:t xml:space="preserve">Last </w:t>
-      </w:r>
-      <w:proofErr w:type="gramStart"/>
-      <w:r>
-        <w:rPr>
-          <w:lang w:val="en-NG"/>
-        </w:rPr>
-        <w:t>Updated :</w:t>
-      </w:r>
-      <w:proofErr w:type="gramEnd"/>
-      <w:r>
-        <w:rPr>
-          <w:lang w:val="en-NG"/>
-        </w:rPr>
-        <w:t> 23 Jul, 2025</w:t>
+        <w:t>Last Updated : 23 Jul, 2025</w:t>
       </w:r>
     </w:p>
     <w:p>
@@ -85,7 +71,6 @@
           <w:lang w:val="en-NG"/>
         </w:rPr>
       </w:pPr>
-      <w:proofErr w:type="gramStart"/>
       <w:r>
         <w:rPr>
           <w:b/>
@@ -94,7 +79,6 @@
         </w:rPr>
         <w:t>Overview :</w:t>
       </w:r>
-      <w:proofErr w:type="gramEnd"/>
       <w:r>
         <w:rPr>
           <w:lang w:val="en-NG"/>
@@ -143,21 +127,7 @@
         <w:rPr>
           <w:lang w:val="en-NG"/>
         </w:rPr>
-        <w:t xml:space="preserve">It is a character encoding standard for electronic communication. American Standard Code for Information </w:t>
-      </w:r>
-      <w:proofErr w:type="gramStart"/>
-      <w:r>
-        <w:rPr>
-          <w:lang w:val="en-NG"/>
-        </w:rPr>
-        <w:t>Interchange(</w:t>
-      </w:r>
-      <w:proofErr w:type="gramEnd"/>
-      <w:r>
-        <w:rPr>
-          <w:lang w:val="en-NG"/>
-        </w:rPr>
-        <w:t>ASCII) and was first launched in 1963. ASCII codes are used to represent text in computers and telecom devices.</w:t>
+        <w:t>It is a character encoding standard for electronic communication. American Standard Code for Information Interchange(ASCII) and was first launched in 1963. ASCII codes are used to represent text in computers and telecom devices.</w:t>
       </w:r>
     </w:p>
     <w:p>
@@ -392,7 +362,13 @@
               <w:rPr>
                 <w:lang w:val="en-NG"/>
               </w:rPr>
-              <w:t>space</w:t>
+              <w:t>S</w:t>
+            </w:r>
+            <w:r>
+              <w:rPr>
+                <w:lang w:val="en-NG"/>
+              </w:rPr>
+              <w:t>pace</w:t>
             </w:r>
           </w:p>
         </w:tc>
@@ -1104,18 +1080,8 @@
           <w:bCs/>
           <w:lang w:val="en-NG"/>
         </w:rPr>
-        <w:t xml:space="preserve">ASCII Vs </w:t>
+        <w:t>ASCII Vs Unicode :</w:t>
       </w:r>
-      <w:proofErr w:type="gramStart"/>
-      <w:r>
-        <w:rPr>
-          <w:b/>
-          <w:bCs/>
-          <w:lang w:val="en-NG"/>
-        </w:rPr>
-        <w:t>Unicode :</w:t>
-      </w:r>
-      <w:proofErr w:type="gramEnd"/>
     </w:p>
     <w:p>
       <w:pPr>
@@ -1169,18 +1135,8 @@
           <w:bCs/>
           <w:lang w:val="en-NG"/>
         </w:rPr>
-        <w:t>Key factor-</w:t>
+        <w:t>Key factor-1 :</w:t>
       </w:r>
-      <w:proofErr w:type="gramStart"/>
-      <w:r>
-        <w:rPr>
-          <w:b/>
-          <w:bCs/>
-          <w:lang w:val="en-NG"/>
-        </w:rPr>
-        <w:t>1 :</w:t>
-      </w:r>
-      <w:proofErr w:type="gramEnd"/>
       <w:r>
         <w:rPr>
           <w:lang w:val="en-NG"/>
@@ -1270,18 +1226,8 @@
           <w:bCs/>
           <w:lang w:val="en-NG"/>
         </w:rPr>
-        <w:t>Key factor-</w:t>
+        <w:t>Key factor-2 :</w:t>
       </w:r>
-      <w:proofErr w:type="gramStart"/>
-      <w:r>
-        <w:rPr>
-          <w:b/>
-          <w:bCs/>
-          <w:lang w:val="en-NG"/>
-        </w:rPr>
-        <w:t>2 :</w:t>
-      </w:r>
-      <w:proofErr w:type="gramEnd"/>
       <w:r>
         <w:rPr>
           <w:lang w:val="en-NG"/>
@@ -1337,7 +1283,6 @@
           <w:lang w:val="en-NG"/>
         </w:rPr>
       </w:pPr>
-      <w:proofErr w:type="gramStart"/>
       <w:r>
         <w:rPr>
           <w:b/>
@@ -1346,7 +1291,6 @@
         </w:rPr>
         <w:t>Conclusion :</w:t>
       </w:r>
-      <w:proofErr w:type="gramEnd"/>
       <w:r>
         <w:rPr>
           <w:lang w:val="en-NG"/>
@@ -2704,6 +2648,7 @@
   <w:style w:type="character" w:default="1" w:styleId="DefaultParagraphFont">
     <w:name w:val="Default Paragraph Font"/>
     <w:uiPriority w:val="1"/>
+    <w:semiHidden/>
     <w:unhideWhenUsed/>
   </w:style>
   <w:style w:type="table" w:default="1" w:styleId="TableNormal">

</xml_diff>